<commit_message>
Proposta com os oito finais
Os finais do Proposta.docx passam a ser os da versão nova (o PDF
Proposta_Caraiba.docx.pdf): A Troca, O Tapiri (Korubo), Rio Acima,
A Honra e O Vazio; depois A Loucura (Tupinambá), Anhangá (Potiguara)
e A Água do Batismo (Caeté).

Co-Authored-By: Claude Opus 5.5 <noreply@anthropic.com>
</commit_message>
<xml_diff>
--- a/Proposta.docx
+++ b/Proposta.docx
@@ -904,13 +904,13 @@
           <w:color w:val="e01b84"/>
           <w:rtl w:val="0"/>
         </w:rPr>
-        <w:t xml:space="preserve">2. A Loucura — Santidade de Jaguaripe.</w:t>
-      </w:r>
-      <w:r>
-        <w:rPr>
-          <w:rtl w:val="0"/>
-        </w:rPr>
-        <w:t xml:space="preserve"> Matar três ou mais pessoas, mesmo doentes. A aldeia expulsa o guardião, e o caminho dele se parece com o dos profetas como Tamandaré-mirim. A tela mostra o que esse caminho viria a se tornar vinte anos depois: a Santidade de Jaguaripe, movimento de 1580 a 1585, liderado por Antônio e por Maria, que pregava a recusa ao trabalho nos engenhos. O governador Manuel Teles Barreto mandou destruí-lo.</w:t>
+        <w:t>2. O Tapiri (o curandeiro) → Korubo.</w:t>
+      </w:r>
+      <w:r>
+        <w:rPr>
+          <w:rtl w:val="0"/>
+        </w:rPr>
+        <w:t xml:space="preserve"> Paralelo antigo: "povos isolados", que é uma situação e não uma etnia. Sugestão: Korubo, do Vale do Javari, no Amazonas, a região com mais povos isolados do mundo. Foram contatados só nos anos 1990, e as barreiras sanitárias da ADPF 709, em 2020, protegeram justamente essa região. Liga o tapiri de 1562 com a quarentena de 2020.</w:t>
       </w:r>
     </w:p>
     <w:p>
@@ -982,6 +982,66 @@
           <w:rtl w:val="0"/>
         </w:rPr>
         <w:t xml:space="preserve">A primeira versão desta proposta tinha sete finais. Temiminó e Guarani ficaram de fora para caber no prazo. O antigo final em que "a tribo temida invade a aldeia" foi trocado: ninguém invade, o medo era boato, e é isso que o final O Vazio mostra.</w:t>
+      </w:r>
+    </w:p>
+    <w:p>
+      <w:pPr>
+        <w:rPr/>
+      </w:pPr>
+      <w:r>
+        <w:rPr>
+          <w:b w:val="1"/>
+          <w:bCs w:val="1"/>
+          <w:color w:val="e01b84"/>
+          <w:rtl w:val="0"/>
+        </w:rPr>
+        <w:t>6. A Loucura — Tupinambá.</w:t>
+      </w:r>
+      <w:r>
+        <w:rPr>
+          <w:rtl w:val="0"/>
+        </w:rPr>
+        <w:t xml:space="preserve"> Vocês matam 3 ou mais pessoas. Vinte anos depois, tupinambá fugidos da escravidão formaram a Santidade de Jaguaripe (1580-1585), que misturava a busca pela Terra sem Mal com símbolos católicos, até ser destruída pelo governador. O nome “Loucura” fala do jogador; a Santidade foi resistência.</w:t>
+      </w:r>
+    </w:p>
+    <w:p>
+      <w:pPr>
+        <w:rPr/>
+      </w:pPr>
+      <w:r>
+        <w:rPr>
+          <w:b w:val="1"/>
+          <w:bCs w:val="1"/>
+          <w:color w:val="e01b84"/>
+          <w:rtl w:val="0"/>
+        </w:rPr>
+        <w:t>7. Anhangá → Potiguara.</w:t>
+      </w:r>
+      <w:r>
+        <w:rPr>
+          <w:rtl w:val="0"/>
+        </w:rPr>
+        <w:t xml:space="preserve"> Vocês olham o veado branco de olhos de fogo em 3 noites e não matam ninguém. Os missionários transformaram esse protetor dos animais em “diabo”, como fizeram com a palavra caraíba.</w:t>
+      </w:r>
+    </w:p>
+    <w:p>
+      <w:pPr>
+        <w:rPr/>
+      </w:pPr>
+      <w:r>
+        <w:rPr>
+          <w:b w:val="1"/>
+          <w:bCs w:val="1"/>
+          <w:color w:val="e01b84"/>
+          <w:rtl w:val="0"/>
+        </w:rPr>
+        <w:t>8. A Água do Batismo → Caeté.</w:t>
+      </w:r>
+      <w:r>
+        <w:rPr>
+          <w:rtl w:val="0"/>
+        </w:rPr>
+        <w:t xml:space="preserve"> Vocês seguem as acusações do pajé 3 vezes, com pelo menos um inocente. Em 1563 os jesuítas batizavam moribundos, e para os indígenas a água chegava junto com a morte. No mesmo período, os Caeté foram declarados escravizáveis.</w:t>
       </w:r>
     </w:p>
     <w:p>

</xml_diff>